<commit_message>
Retrospective sprint 2 gemaakt
</commit_message>
<xml_diff>
--- a/Algemene Documentatie/Sjablonen/Sjabloon 6 - Retrospective.docx
+++ b/Algemene Documentatie/Sjablonen/Sjabloon 6 - Retrospective.docx
@@ -358,7 +358,7 @@
       <w:sdtContent>
         <w:p>
           <w:pPr>
-            <w:pStyle w:val="Kopvaninhoudsopgave"/>
+            <w:pStyle w:val="TOCHeading"/>
           </w:pPr>
           <w:r>
             <w:t>Inhoud</w:t>
@@ -366,7 +366,7 @@
         </w:p>
         <w:p>
           <w:pPr>
-            <w:pStyle w:val="Inhopg1"/>
+            <w:pStyle w:val="TOC1"/>
             <w:rPr>
               <w:rFonts w:eastAsiaTheme="minorEastAsia"/>
               <w:noProof/>
@@ -446,7 +446,7 @@
         </w:p>
         <w:p>
           <w:pPr>
-            <w:pStyle w:val="Inhopg1"/>
+            <w:pStyle w:val="TOC1"/>
             <w:rPr>
               <w:rFonts w:eastAsiaTheme="minorEastAsia"/>
               <w:noProof/>
@@ -517,7 +517,7 @@
         </w:p>
         <w:p>
           <w:pPr>
-            <w:pStyle w:val="Inhopg2"/>
+            <w:pStyle w:val="TOC2"/>
             <w:tabs>
               <w:tab w:val="right" w:leader="dot" w:pos="9062"/>
             </w:tabs>
@@ -591,7 +591,7 @@
         </w:p>
         <w:p>
           <w:pPr>
-            <w:pStyle w:val="Inhopg2"/>
+            <w:pStyle w:val="TOC2"/>
             <w:tabs>
               <w:tab w:val="right" w:leader="dot" w:pos="9062"/>
             </w:tabs>
@@ -665,7 +665,7 @@
         </w:p>
         <w:p>
           <w:pPr>
-            <w:pStyle w:val="Inhopg2"/>
+            <w:pStyle w:val="TOC2"/>
             <w:tabs>
               <w:tab w:val="right" w:leader="dot" w:pos="9062"/>
             </w:tabs>
@@ -739,7 +739,7 @@
         </w:p>
         <w:p>
           <w:pPr>
-            <w:pStyle w:val="Inhopg2"/>
+            <w:pStyle w:val="TOC2"/>
             <w:tabs>
               <w:tab w:val="right" w:leader="dot" w:pos="9062"/>
             </w:tabs>
@@ -813,7 +813,7 @@
         </w:p>
         <w:p>
           <w:pPr>
-            <w:pStyle w:val="Inhopg2"/>
+            <w:pStyle w:val="TOC2"/>
             <w:tabs>
               <w:tab w:val="right" w:leader="dot" w:pos="9062"/>
             </w:tabs>
@@ -887,7 +887,7 @@
         </w:p>
         <w:p>
           <w:pPr>
-            <w:pStyle w:val="Inhopg2"/>
+            <w:pStyle w:val="TOC2"/>
             <w:tabs>
               <w:tab w:val="right" w:leader="dot" w:pos="9062"/>
             </w:tabs>
@@ -961,7 +961,7 @@
         </w:p>
         <w:p>
           <w:pPr>
-            <w:pStyle w:val="Inhopg1"/>
+            <w:pStyle w:val="TOC1"/>
             <w:rPr>
               <w:rFonts w:eastAsiaTheme="minorEastAsia"/>
               <w:noProof/>
@@ -1032,7 +1032,7 @@
         </w:p>
         <w:p>
           <w:pPr>
-            <w:pStyle w:val="Inhopg2"/>
+            <w:pStyle w:val="TOC2"/>
             <w:tabs>
               <w:tab w:val="right" w:leader="dot" w:pos="9062"/>
             </w:tabs>
@@ -1106,7 +1106,7 @@
         </w:p>
         <w:p>
           <w:pPr>
-            <w:pStyle w:val="Inhopg2"/>
+            <w:pStyle w:val="TOC2"/>
             <w:tabs>
               <w:tab w:val="right" w:leader="dot" w:pos="9062"/>
             </w:tabs>
@@ -1180,7 +1180,7 @@
         </w:p>
         <w:p>
           <w:pPr>
-            <w:pStyle w:val="Inhopg2"/>
+            <w:pStyle w:val="TOC2"/>
             <w:tabs>
               <w:tab w:val="right" w:leader="dot" w:pos="9062"/>
             </w:tabs>
@@ -1254,7 +1254,7 @@
         </w:p>
         <w:p>
           <w:pPr>
-            <w:pStyle w:val="Inhopg2"/>
+            <w:pStyle w:val="TOC2"/>
             <w:tabs>
               <w:tab w:val="right" w:leader="dot" w:pos="9062"/>
             </w:tabs>
@@ -1328,7 +1328,7 @@
         </w:p>
         <w:p>
           <w:pPr>
-            <w:pStyle w:val="Inhopg2"/>
+            <w:pStyle w:val="TOC2"/>
             <w:tabs>
               <w:tab w:val="right" w:leader="dot" w:pos="9062"/>
             </w:tabs>
@@ -1402,7 +1402,7 @@
         </w:p>
         <w:p>
           <w:pPr>
-            <w:pStyle w:val="Inhopg2"/>
+            <w:pStyle w:val="TOC2"/>
             <w:tabs>
               <w:tab w:val="right" w:leader="dot" w:pos="9062"/>
             </w:tabs>
@@ -1476,7 +1476,7 @@
         </w:p>
         <w:p>
           <w:pPr>
-            <w:pStyle w:val="Inhopg1"/>
+            <w:pStyle w:val="TOC1"/>
             <w:rPr>
               <w:rFonts w:eastAsiaTheme="minorEastAsia"/>
               <w:noProof/>
@@ -1547,7 +1547,7 @@
         </w:p>
         <w:p>
           <w:pPr>
-            <w:pStyle w:val="Inhopg2"/>
+            <w:pStyle w:val="TOC2"/>
             <w:tabs>
               <w:tab w:val="right" w:leader="dot" w:pos="9062"/>
             </w:tabs>
@@ -1621,7 +1621,7 @@
         </w:p>
         <w:p>
           <w:pPr>
-            <w:pStyle w:val="Inhopg2"/>
+            <w:pStyle w:val="TOC2"/>
             <w:tabs>
               <w:tab w:val="right" w:leader="dot" w:pos="9062"/>
             </w:tabs>
@@ -1695,7 +1695,7 @@
         </w:p>
         <w:p>
           <w:pPr>
-            <w:pStyle w:val="Inhopg2"/>
+            <w:pStyle w:val="TOC2"/>
             <w:tabs>
               <w:tab w:val="right" w:leader="dot" w:pos="9062"/>
             </w:tabs>
@@ -1769,7 +1769,7 @@
         </w:p>
         <w:p>
           <w:pPr>
-            <w:pStyle w:val="Inhopg2"/>
+            <w:pStyle w:val="TOC2"/>
             <w:tabs>
               <w:tab w:val="right" w:leader="dot" w:pos="9062"/>
             </w:tabs>
@@ -1843,7 +1843,7 @@
         </w:p>
         <w:p>
           <w:pPr>
-            <w:pStyle w:val="Inhopg2"/>
+            <w:pStyle w:val="TOC2"/>
             <w:tabs>
               <w:tab w:val="right" w:leader="dot" w:pos="9062"/>
             </w:tabs>
@@ -1917,7 +1917,7 @@
         </w:p>
         <w:p>
           <w:pPr>
-            <w:pStyle w:val="Inhopg2"/>
+            <w:pStyle w:val="TOC2"/>
             <w:tabs>
               <w:tab w:val="right" w:leader="dot" w:pos="9062"/>
             </w:tabs>
@@ -2015,7 +2015,7 @@
     </w:p>
     <w:p>
       <w:pPr>
-        <w:pStyle w:val="Kop1"/>
+        <w:pStyle w:val="Heading1"/>
         <w:jc w:val="left"/>
       </w:pPr>
       <w:bookmarkStart w:id="0" w:name="_Toc202875007"/>
@@ -2173,7 +2173,7 @@
     </w:p>
     <w:p>
       <w:pPr>
-        <w:pStyle w:val="Lijstalinea"/>
+        <w:pStyle w:val="ListParagraph"/>
         <w:numPr>
           <w:ilvl w:val="0"/>
           <w:numId w:val="29"/>
@@ -2201,7 +2201,7 @@
     </w:p>
     <w:p>
       <w:pPr>
-        <w:pStyle w:val="Lijstalinea"/>
+        <w:pStyle w:val="ListParagraph"/>
         <w:numPr>
           <w:ilvl w:val="0"/>
           <w:numId w:val="29"/>
@@ -2236,7 +2236,7 @@
     </w:p>
     <w:p>
       <w:pPr>
-        <w:pStyle w:val="Lijstalinea"/>
+        <w:pStyle w:val="ListParagraph"/>
         <w:numPr>
           <w:ilvl w:val="0"/>
           <w:numId w:val="29"/>
@@ -2264,7 +2264,7 @@
     </w:p>
     <w:p>
       <w:pPr>
-        <w:pStyle w:val="Lijstalinea"/>
+        <w:pStyle w:val="ListParagraph"/>
         <w:numPr>
           <w:ilvl w:val="0"/>
           <w:numId w:val="29"/>
@@ -2292,7 +2292,7 @@
     </w:p>
     <w:p>
       <w:pPr>
-        <w:pStyle w:val="Lijstalinea"/>
+        <w:pStyle w:val="ListParagraph"/>
         <w:numPr>
           <w:ilvl w:val="0"/>
           <w:numId w:val="29"/>
@@ -2334,7 +2334,7 @@
     </w:p>
     <w:p>
       <w:pPr>
-        <w:pStyle w:val="Lijstalinea"/>
+        <w:pStyle w:val="ListParagraph"/>
         <w:numPr>
           <w:ilvl w:val="0"/>
           <w:numId w:val="29"/>
@@ -2362,7 +2362,7 @@
     </w:p>
     <w:p>
       <w:pPr>
-        <w:pStyle w:val="Lijstalinea"/>
+        <w:pStyle w:val="ListParagraph"/>
         <w:numPr>
           <w:ilvl w:val="1"/>
           <w:numId w:val="29"/>
@@ -2390,7 +2390,7 @@
     </w:p>
     <w:p>
       <w:pPr>
-        <w:pStyle w:val="Lijstalinea"/>
+        <w:pStyle w:val="ListParagraph"/>
         <w:numPr>
           <w:ilvl w:val="1"/>
           <w:numId w:val="29"/>
@@ -2472,7 +2472,7 @@
     </w:p>
     <w:p>
       <w:pPr>
-        <w:pStyle w:val="Kop1"/>
+        <w:pStyle w:val="Heading1"/>
         <w:jc w:val="left"/>
       </w:pPr>
       <w:bookmarkStart w:id="1" w:name="_Toc202875008"/>
@@ -2484,7 +2484,7 @@
     </w:p>
     <w:p>
       <w:pPr>
-        <w:pStyle w:val="Kop2"/>
+        <w:pStyle w:val="Heading2"/>
         <w:rPr>
           <w:i/>
           <w:iCs/>
@@ -2526,7 +2526,7 @@
     </w:p>
     <w:p>
       <w:pPr>
-        <w:pStyle w:val="Kop2"/>
+        <w:pStyle w:val="Heading2"/>
       </w:pPr>
       <w:bookmarkStart w:id="3" w:name="_Toc202875010"/>
       <w:r>
@@ -2551,6 +2551,9 @@
     </w:p>
     <w:p>
       <w:r>
+        <w:rPr>
+          <w:noProof/>
+        </w:rPr>
         <w:drawing>
           <wp:inline distT="0" distB="0" distL="0" distR="0" wp14:anchorId="3DC5AE92" wp14:editId="1DEAF040">
             <wp:extent cx="5760720" cy="2730500"/>
@@ -2599,7 +2602,7 @@
     </w:p>
     <w:p>
       <w:pPr>
-        <w:pStyle w:val="Kop2"/>
+        <w:pStyle w:val="Heading2"/>
       </w:pPr>
       <w:bookmarkStart w:id="4" w:name="_Toc202875011"/>
       <w:r>
@@ -2623,7 +2626,7 @@
     </w:p>
     <w:p>
       <w:pPr>
-        <w:pStyle w:val="Kop2"/>
+        <w:pStyle w:val="Heading2"/>
       </w:pPr>
       <w:bookmarkStart w:id="5" w:name="_Toc202875012"/>
       <w:r>
@@ -2647,7 +2650,7 @@
     </w:p>
     <w:p>
       <w:pPr>
-        <w:pStyle w:val="Kop2"/>
+        <w:pStyle w:val="Heading2"/>
       </w:pPr>
       <w:bookmarkStart w:id="6" w:name="_Toc202875013"/>
       <w:r>
@@ -2708,7 +2711,7 @@
     </w:p>
     <w:p>
       <w:pPr>
-        <w:pStyle w:val="Kop2"/>
+        <w:pStyle w:val="Heading2"/>
       </w:pPr>
       <w:bookmarkStart w:id="7" w:name="_Toc202875014"/>
       <w:r>
@@ -3422,7 +3425,7 @@
     </w:p>
     <w:p>
       <w:pPr>
-        <w:pStyle w:val="Kop1"/>
+        <w:pStyle w:val="Heading1"/>
         <w:jc w:val="left"/>
       </w:pPr>
       <w:bookmarkStart w:id="8" w:name="_Toc202875015"/>
@@ -3434,7 +3437,7 @@
     </w:p>
     <w:p>
       <w:pPr>
-        <w:pStyle w:val="Kop2"/>
+        <w:pStyle w:val="Heading2"/>
         <w:rPr>
           <w:i/>
           <w:iCs/>
@@ -3463,7 +3466,7 @@
           <w:iCs/>
           <w:color w:val="000000" w:themeColor="text1"/>
         </w:rPr>
-        <w:t>…</w:t>
+        <w:t>We hebben grotendeels de turn</w:t>
       </w:r>
       <w:r>
         <w:rPr>
@@ -3471,12 +3474,28 @@
           <w:iCs/>
           <w:color w:val="000000" w:themeColor="text1"/>
         </w:rPr>
-        <w:br/>
+        <w:t>-</w:t>
+      </w:r>
+      <w:r>
+        <w:rPr>
+          <w:i/>
+          <w:iCs/>
+          <w:color w:val="000000" w:themeColor="text1"/>
+        </w:rPr>
+        <w:t xml:space="preserve">based game gemaakt deze sprint. </w:t>
+      </w:r>
+      <w:r>
+        <w:rPr>
+          <w:i/>
+          <w:iCs/>
+          <w:color w:val="000000" w:themeColor="text1"/>
+        </w:rPr>
+        <w:t xml:space="preserve">De communicatie ging erg slecht deze sprint. Mensen hadden allemaal een net wat ander beeld van de game waardoor er onduidelijkheden en errors ontstonden. </w:t>
       </w:r>
     </w:p>
     <w:p>
       <w:pPr>
-        <w:pStyle w:val="Kop2"/>
+        <w:pStyle w:val="Heading2"/>
       </w:pPr>
       <w:bookmarkStart w:id="10" w:name="_Toc202875017"/>
       <w:r>
@@ -3498,7 +3517,44 @@
     </w:p>
     <w:p>
       <w:r>
-        <w:t>…</w:t>
+        <w:rPr>
+          <w:noProof/>
+        </w:rPr>
+        <w:drawing>
+          <wp:inline distT="0" distB="0" distL="0" distR="0" wp14:anchorId="4DF62009" wp14:editId="5760769D">
+            <wp:extent cx="5760720" cy="2971165"/>
+            <wp:effectExtent l="0" t="0" r="0" b="635"/>
+            <wp:docPr id="2006527233" name="Picture 1"/>
+            <wp:cNvGraphicFramePr>
+              <a:graphicFrameLocks xmlns:a="http://schemas.openxmlformats.org/drawingml/2006/main" noChangeAspect="1"/>
+            </wp:cNvGraphicFramePr>
+            <a:graphic xmlns:a="http://schemas.openxmlformats.org/drawingml/2006/main">
+              <a:graphicData uri="http://schemas.openxmlformats.org/drawingml/2006/picture">
+                <pic:pic xmlns:pic="http://schemas.openxmlformats.org/drawingml/2006/picture">
+                  <pic:nvPicPr>
+                    <pic:cNvPr id="2006527233" name=""/>
+                    <pic:cNvPicPr/>
+                  </pic:nvPicPr>
+                  <pic:blipFill>
+                    <a:blip r:embed="rId13"/>
+                    <a:stretch>
+                      <a:fillRect/>
+                    </a:stretch>
+                  </pic:blipFill>
+                  <pic:spPr>
+                    <a:xfrm>
+                      <a:off x="0" y="0"/>
+                      <a:ext cx="5760720" cy="2971165"/>
+                    </a:xfrm>
+                    <a:prstGeom prst="rect">
+                      <a:avLst/>
+                    </a:prstGeom>
+                  </pic:spPr>
+                </pic:pic>
+              </a:graphicData>
+            </a:graphic>
+          </wp:inline>
+        </w:drawing>
       </w:r>
       <w:r>
         <w:br/>
@@ -3506,7 +3562,7 @@
     </w:p>
     <w:p>
       <w:pPr>
-        <w:pStyle w:val="Kop2"/>
+        <w:pStyle w:val="Heading2"/>
       </w:pPr>
       <w:bookmarkStart w:id="11" w:name="_Toc202875018"/>
       <w:r>
@@ -3516,7 +3572,7 @@
     </w:p>
     <w:p>
       <w:r>
-        <w:t>…</w:t>
+        <w:t xml:space="preserve">Er zijn geen testen uitgevoerd deze sprint. </w:t>
       </w:r>
       <w:r>
         <w:br/>
@@ -3524,7 +3580,7 @@
     </w:p>
     <w:p>
       <w:pPr>
-        <w:pStyle w:val="Kop2"/>
+        <w:pStyle w:val="Heading2"/>
       </w:pPr>
       <w:bookmarkStart w:id="12" w:name="_Toc202875019"/>
       <w:r>
@@ -3534,7 +3590,7 @@
     </w:p>
     <w:p>
       <w:r>
-        <w:t>…</w:t>
+        <w:t>Niet van toepassing.</w:t>
       </w:r>
       <w:r>
         <w:br/>
@@ -3542,7 +3598,7 @@
     </w:p>
     <w:p>
       <w:pPr>
-        <w:pStyle w:val="Kop2"/>
+        <w:pStyle w:val="Heading2"/>
       </w:pPr>
       <w:bookmarkStart w:id="13" w:name="_Toc202875020"/>
       <w:r>
@@ -3557,16 +3613,180 @@
       <w:bookmarkEnd w:id="13"/>
     </w:p>
     <w:p>
-      <w:r>
-        <w:t>…</w:t>
-      </w:r>
-      <w:r>
-        <w:br/>
+      <w:pPr>
+        <w:rPr>
+          <w:b/>
+          <w:bCs/>
+        </w:rPr>
+      </w:pPr>
+      <w:r>
+        <w:rPr>
+          <w:b/>
+          <w:bCs/>
+        </w:rPr>
+        <w:t>Esat, Lead Programmer:</w:t>
       </w:r>
     </w:p>
     <w:p>
-      <w:pPr>
-        <w:pStyle w:val="Kop2"/>
+      <w:r>
+        <w:t>Esat had zijn ta</w:t>
+      </w:r>
+      <w:r>
+        <w:t>ak als lead programmer</w:t>
+      </w:r>
+      <w:r>
+        <w:t xml:space="preserve"> volgens het team</w:t>
+      </w:r>
+      <w:r>
+        <w:t xml:space="preserve"> niet goed uitgevoerd. </w:t>
+      </w:r>
+      <w:r>
+        <w:t>Als Lead Programmer heeft hij vrij weinig ge</w:t>
+      </w:r>
+      <w:r>
+        <w:t>daan qua programmeren. Daarnaast heeft het team zijn twijfels over Esats afwezigheid.</w:t>
+      </w:r>
+    </w:p>
+    <w:p>
+      <w:pPr>
+        <w:rPr>
+          <w:b/>
+          <w:bCs/>
+        </w:rPr>
+      </w:pPr>
+      <w:r>
+        <w:rPr>
+          <w:b/>
+          <w:bCs/>
+        </w:rPr>
+        <w:t>Yorick, SCRUM master:</w:t>
+      </w:r>
+    </w:p>
+    <w:p>
+      <w:r>
+        <w:t>Yorick heeft er goed o</w:t>
+      </w:r>
+      <w:r>
+        <w:t xml:space="preserve">p gelet of iedereen netjes hun stand-up maakte. Nam initiatief om een strike uit te delen maar de persoon wiens strike uitgedeeld moest worden was afwezig. </w:t>
+      </w:r>
+    </w:p>
+    <w:p>
+      <w:pPr>
+        <w:rPr>
+          <w:b/>
+          <w:bCs/>
+        </w:rPr>
+      </w:pPr>
+      <w:r>
+        <w:rPr>
+          <w:b/>
+          <w:bCs/>
+        </w:rPr>
+        <w:lastRenderedPageBreak/>
+        <w:t>Gido, Product Owner:</w:t>
+      </w:r>
+    </w:p>
+    <w:p>
+      <w:r>
+        <w:t>Gido heeft de Tr</w:t>
+      </w:r>
+      <w:r>
+        <w:t>ello goed aangemaakt maar kon beter nachecken gezien er een dubbele userstory stond. Daarnaast werd de Trello niet regulier bijgehouden. Ook had hij beter het game concept over kunnen brengen zodat iedereen een goed idee zou hebben van de game.</w:t>
+      </w:r>
+    </w:p>
+    <w:p>
+      <w:pPr>
+        <w:rPr>
+          <w:b/>
+          <w:bCs/>
+        </w:rPr>
+      </w:pPr>
+      <w:r>
+        <w:rPr>
+          <w:b/>
+          <w:bCs/>
+        </w:rPr>
+        <w:t>Ruben, UI/UX designer:</w:t>
+      </w:r>
+    </w:p>
+    <w:p>
+      <w:r>
+        <w:t>Ruben heeft mooie, bijpassende UI gemaakt die goed met de stijl van de game past.</w:t>
+      </w:r>
+    </w:p>
+    <w:p>
+      <w:pPr>
+        <w:rPr>
+          <w:b/>
+          <w:bCs/>
+        </w:rPr>
+      </w:pPr>
+      <w:r>
+        <w:rPr>
+          <w:b/>
+          <w:bCs/>
+        </w:rPr>
+        <w:t>Daniël, QA Tester:</w:t>
+      </w:r>
+    </w:p>
+    <w:p>
+      <w:r>
+        <w:t xml:space="preserve">Kon iets meer initiatief tonen om te beginnen met testen. Had de groep beter bij het test proces kunnen betrekken. </w:t>
+      </w:r>
+    </w:p>
+    <w:p>
+      <w:pPr>
+        <w:rPr>
+          <w:b/>
+          <w:bCs/>
+        </w:rPr>
+      </w:pPr>
+      <w:r>
+        <w:rPr>
+          <w:b/>
+          <w:bCs/>
+        </w:rPr>
+        <w:t>Fleur, Notulist:</w:t>
+      </w:r>
+    </w:p>
+    <w:p>
+      <w:r>
+        <w:t>Er waren niet genoeg team meetings om notulen over te maken dus er zijn alleen notulen gemaakt van de presentatie/assessment. Notulen die er was is duidelijk en uitgebreid genoeg. Wel is het een beetje chaotisch het zou handig zijn om 1 stijl aan te houden.</w:t>
+      </w:r>
+    </w:p>
+    <w:p>
+      <w:pPr>
+        <w:rPr>
+          <w:b/>
+          <w:bCs/>
+          <w:lang w:val="en-GB"/>
+        </w:rPr>
+      </w:pPr>
+      <w:r>
+        <w:rPr>
+          <w:b/>
+          <w:bCs/>
+          <w:lang w:val="en-GB"/>
+        </w:rPr>
+        <w:t>Jorick, Presentator:</w:t>
+      </w:r>
+    </w:p>
+    <w:p>
+      <w:r>
+        <w:t>Jorick heeft het concept e</w:t>
+      </w:r>
+      <w:r>
+        <w:t xml:space="preserve">n het proces duidelijk overgebracht tijdens de presentatie. Wel was hij vergeten wat toe te voegen aan de powerpoint maar dit legde hij later alsnog uit. Daarnaast was er een opmerking van de docenten dat het beter zou zijn om ‘wel gelukt’ en ‘niet gelukt’ te veranderen naar ‘gerealiseerd’ en ‘werkzaamheden voor de volgende sprint’. </w:t>
+      </w:r>
+    </w:p>
+    <w:p>
+      <w:r>
+        <w:br/>
+      </w:r>
+    </w:p>
+    <w:p>
+      <w:pPr>
+        <w:pStyle w:val="Heading2"/>
       </w:pPr>
       <w:bookmarkStart w:id="14" w:name="_Toc202875021"/>
       <w:r>
@@ -3666,7 +3886,7 @@
                 <w:rFonts w:ascii="Calibri" w:eastAsia="Times New Roman" w:hAnsi="Calibri" w:cs="Calibri"/>
                 <w:color w:val="000000"/>
               </w:rPr>
-              <w:t>…</w:t>
+              <w:t>1. Aangeven waar de speler zijn characters staan.</w:t>
             </w:r>
           </w:p>
         </w:tc>
@@ -3748,7 +3968,42 @@
                 <w:rFonts w:ascii="Calibri" w:eastAsia="Times New Roman" w:hAnsi="Calibri" w:cs="Calibri"/>
                 <w:color w:val="000000"/>
               </w:rPr>
-              <w:t>Als … wil ik … zodat …</w:t>
+              <w:t xml:space="preserve">Als </w:t>
+            </w:r>
+            <w:r>
+              <w:rPr>
+                <w:rFonts w:ascii="Calibri" w:eastAsia="Times New Roman" w:hAnsi="Calibri" w:cs="Calibri"/>
+                <w:color w:val="000000"/>
+              </w:rPr>
+              <w:t>speler</w:t>
+            </w:r>
+            <w:r>
+              <w:rPr>
+                <w:rFonts w:ascii="Calibri" w:eastAsia="Times New Roman" w:hAnsi="Calibri" w:cs="Calibri"/>
+                <w:color w:val="000000"/>
+              </w:rPr>
+              <w:t xml:space="preserve"> wil ik </w:t>
+            </w:r>
+            <w:r>
+              <w:rPr>
+                <w:rFonts w:ascii="Calibri" w:eastAsia="Times New Roman" w:hAnsi="Calibri" w:cs="Calibri"/>
+                <w:color w:val="000000"/>
+              </w:rPr>
+              <w:t xml:space="preserve">kunnen weten waar mijn karakters staan wanneer ze niet op de camera te zien zijn </w:t>
+            </w:r>
+            <w:r>
+              <w:rPr>
+                <w:rFonts w:ascii="Calibri" w:eastAsia="Times New Roman" w:hAnsi="Calibri" w:cs="Calibri"/>
+                <w:color w:val="000000"/>
+              </w:rPr>
+              <w:t xml:space="preserve">zodat </w:t>
+            </w:r>
+            <w:r>
+              <w:rPr>
+                <w:rFonts w:ascii="Calibri" w:eastAsia="Times New Roman" w:hAnsi="Calibri" w:cs="Calibri"/>
+                <w:color w:val="000000"/>
+              </w:rPr>
+              <w:t>ik niet mijn karakters hoef te zoeken.</w:t>
             </w:r>
           </w:p>
         </w:tc>
@@ -3818,7 +4073,7 @@
                 <w:rFonts w:ascii="Calibri" w:eastAsia="Times New Roman" w:hAnsi="Calibri" w:cs="Calibri"/>
                 <w:color w:val="000000"/>
               </w:rPr>
-              <w:t>1-5</w:t>
+              <w:t>3</w:t>
             </w:r>
           </w:p>
         </w:tc>
@@ -3883,7 +4138,7 @@
                 <w:rFonts w:ascii="Calibri" w:eastAsia="Times New Roman" w:hAnsi="Calibri" w:cs="Calibri"/>
                 <w:color w:val="000000"/>
               </w:rPr>
-              <w:t>0,0.5,1,2,3,5,8,13,20</w:t>
+              <w:t>2</w:t>
             </w:r>
           </w:p>
         </w:tc>
@@ -3979,7 +4234,7 @@
                 <w:rFonts w:ascii="Calibri" w:eastAsia="Times New Roman" w:hAnsi="Calibri" w:cs="Calibri"/>
                 <w:color w:val="000000"/>
               </w:rPr>
-              <w:t>…</w:t>
+              <w:t>2. Healthbar</w:t>
             </w:r>
           </w:p>
         </w:tc>
@@ -4061,7 +4316,42 @@
                 <w:rFonts w:ascii="Calibri" w:eastAsia="Times New Roman" w:hAnsi="Calibri" w:cs="Calibri"/>
                 <w:color w:val="000000"/>
               </w:rPr>
-              <w:t>Als … wil ik … zodat …</w:t>
+              <w:t xml:space="preserve">Als </w:t>
+            </w:r>
+            <w:r>
+              <w:rPr>
+                <w:rFonts w:ascii="Calibri" w:eastAsia="Times New Roman" w:hAnsi="Calibri" w:cs="Calibri"/>
+                <w:color w:val="000000"/>
+              </w:rPr>
+              <w:t>de speler</w:t>
+            </w:r>
+            <w:r>
+              <w:rPr>
+                <w:rFonts w:ascii="Calibri" w:eastAsia="Times New Roman" w:hAnsi="Calibri" w:cs="Calibri"/>
+                <w:color w:val="000000"/>
+              </w:rPr>
+              <w:t xml:space="preserve"> wil ik </w:t>
+            </w:r>
+            <w:r>
+              <w:rPr>
+                <w:rFonts w:ascii="Calibri" w:eastAsia="Times New Roman" w:hAnsi="Calibri" w:cs="Calibri"/>
+                <w:color w:val="000000"/>
+              </w:rPr>
+              <w:t>dat zowel mijn karakters als die van mijn tegenstanders een health bar hebben</w:t>
+            </w:r>
+            <w:r>
+              <w:rPr>
+                <w:rFonts w:ascii="Calibri" w:eastAsia="Times New Roman" w:hAnsi="Calibri" w:cs="Calibri"/>
+                <w:color w:val="000000"/>
+              </w:rPr>
+              <w:t xml:space="preserve"> zodat </w:t>
+            </w:r>
+            <w:r>
+              <w:rPr>
+                <w:rFonts w:ascii="Calibri" w:eastAsia="Times New Roman" w:hAnsi="Calibri" w:cs="Calibri"/>
+                <w:color w:val="000000"/>
+              </w:rPr>
+              <w:t>ik duidelijk kan zien welke karakters bijna dood zijn.</w:t>
             </w:r>
           </w:p>
         </w:tc>
@@ -4131,7 +4421,7 @@
                 <w:rFonts w:ascii="Calibri" w:eastAsia="Times New Roman" w:hAnsi="Calibri" w:cs="Calibri"/>
                 <w:color w:val="000000"/>
               </w:rPr>
-              <w:t>1-5</w:t>
+              <w:t>4</w:t>
             </w:r>
           </w:p>
         </w:tc>
@@ -4196,7 +4486,7 @@
                 <w:rFonts w:ascii="Calibri" w:eastAsia="Times New Roman" w:hAnsi="Calibri" w:cs="Calibri"/>
                 <w:color w:val="000000"/>
               </w:rPr>
-              <w:t>0,0.5,1,2,3,5,8,13,20</w:t>
+              <w:t>2</w:t>
             </w:r>
           </w:p>
         </w:tc>
@@ -4210,7 +4500,7 @@
     </w:p>
     <w:p>
       <w:pPr>
-        <w:pStyle w:val="Kop1"/>
+        <w:pStyle w:val="Heading1"/>
         <w:jc w:val="left"/>
       </w:pPr>
       <w:bookmarkStart w:id="15" w:name="_Toc202875022"/>
@@ -4222,7 +4512,7 @@
     </w:p>
     <w:p>
       <w:pPr>
-        <w:pStyle w:val="Kop2"/>
+        <w:pStyle w:val="Heading2"/>
         <w:rPr>
           <w:i/>
           <w:iCs/>
@@ -4264,7 +4554,7 @@
     </w:p>
     <w:p>
       <w:pPr>
-        <w:pStyle w:val="Kop2"/>
+        <w:pStyle w:val="Heading2"/>
       </w:pPr>
       <w:bookmarkStart w:id="17" w:name="_Toc202875024"/>
       <w:r>
@@ -4294,7 +4584,7 @@
     </w:p>
     <w:p>
       <w:pPr>
-        <w:pStyle w:val="Kop2"/>
+        <w:pStyle w:val="Heading2"/>
       </w:pPr>
       <w:bookmarkStart w:id="18" w:name="_Toc202875025"/>
       <w:r>
@@ -4312,7 +4602,7 @@
     </w:p>
     <w:p>
       <w:pPr>
-        <w:pStyle w:val="Kop2"/>
+        <w:pStyle w:val="Heading2"/>
       </w:pPr>
       <w:bookmarkStart w:id="19" w:name="_Toc202875026"/>
       <w:r>
@@ -4330,7 +4620,7 @@
     </w:p>
     <w:p>
       <w:pPr>
-        <w:pStyle w:val="Kop2"/>
+        <w:pStyle w:val="Heading2"/>
       </w:pPr>
       <w:bookmarkStart w:id="20" w:name="_Toc202875027"/>
       <w:r>
@@ -4354,7 +4644,7 @@
     </w:p>
     <w:p>
       <w:pPr>
-        <w:pStyle w:val="Kop2"/>
+        <w:pStyle w:val="Heading2"/>
       </w:pPr>
       <w:bookmarkStart w:id="21" w:name="_Toc202875028"/>
       <w:r>
@@ -4993,9 +5283,9 @@
     <w:p/>
     <w:p/>
     <w:sectPr>
-      <w:footerReference w:type="default" r:id="rId13"/>
-      <w:headerReference w:type="first" r:id="rId14"/>
-      <w:footerReference w:type="first" r:id="rId15"/>
+      <w:footerReference w:type="default" r:id="rId14"/>
+      <w:headerReference w:type="first" r:id="rId15"/>
+      <w:footerReference w:type="first" r:id="rId16"/>
       <w:pgSz w:w="11906" w:h="16838"/>
       <w:pgMar w:top="1417" w:right="1417" w:bottom="1417" w:left="1417" w:header="708" w:footer="708" w:gutter="0"/>
       <w:cols w:space="708"/>
@@ -5341,7 +5631,7 @@
 <w:hdr xmlns:wpc="http://schemas.microsoft.com/office/word/2010/wordprocessingCanvas" xmlns:cx="http://schemas.microsoft.com/office/drawing/2014/chartex" xmlns:cx1="http://schemas.microsoft.com/office/drawing/2015/9/8/chartex" xmlns:cx2="http://schemas.microsoft.com/office/drawing/2015/10/21/chartex" xmlns:cx3="http://schemas.microsoft.com/office/drawing/2016/5/9/chartex" xmlns:cx4="http://schemas.microsoft.com/office/drawing/2016/5/10/chartex" xmlns:cx5="http://schemas.microsoft.com/office/drawing/2016/5/11/chartex" xmlns:cx6="http://schemas.microsoft.com/office/drawing/2016/5/12/chartex" xmlns:cx7="http://schemas.microsoft.com/office/drawing/2016/5/13/chartex" xmlns:cx8="http://schemas.microsoft.com/office/drawing/2016/5/14/chartex" xmlns:mc="http://schemas.openxmlformats.org/markup-compatibility/2006" xmlns:aink="http://schemas.microsoft.com/office/drawing/2016/ink" xmlns:am3d="http://schemas.microsoft.com/office/drawing/2017/model3d" xmlns:o="urn:schemas-microsoft-com:office:office" xmlns:oel="http://schemas.microsoft.com/office/2019/extlst" xmlns:r="http://schemas.openxmlformats.org/officeDocument/2006/relationships" xmlns:m="http://schemas.openxmlformats.org/officeDocument/2006/math" xmlns:v="urn:schemas-microsoft-com:vml" xmlns:wp14="http://schemas.microsoft.com/office/word/2010/wordprocessingDrawing" xmlns:wp="http://schemas.openxmlformats.org/drawingml/2006/wordprocessingDrawing" xmlns:w10="urn:schemas-microsoft-com:office:word" xmlns:w="http://schemas.openxmlformats.org/wordprocessingml/2006/main" xmlns:w14="http://schemas.microsoft.com/office/word/2010/wordml" xmlns:w15="http://schemas.microsoft.com/office/word/2012/wordml" xmlns:w16cex="http://schemas.microsoft.com/office/word/2018/wordml/cex" xmlns:w16cid="http://schemas.microsoft.com/office/word/2016/wordml/cid" xmlns:w16="http://schemas.microsoft.com/office/word/2018/wordml" xmlns:w16du="http://schemas.microsoft.com/office/word/2023/wordml/word16du" xmlns:w16sdtdh="http://schemas.microsoft.com/office/word/2020/wordml/sdtdatahash" xmlns:w16sdtfl="http://schemas.microsoft.com/office/word/2024/wordml/sdtformatlock" xmlns:w16se="http://schemas.microsoft.com/office/word/2015/wordml/symex" xmlns:wpg="http://schemas.microsoft.com/office/word/2010/wordprocessingGroup" xmlns:wpi="http://schemas.microsoft.com/office/word/2010/wordprocessingInk" xmlns:wne="http://schemas.microsoft.com/office/word/2006/wordml" xmlns:wps="http://schemas.microsoft.com/office/word/2010/wordprocessingShape" mc:Ignorable="w14 w15 w16se w16cid w16 w16cex w16sdtdh w16sdtfl w16du wp14">
   <w:p>
     <w:pPr>
-      <w:pStyle w:val="Koptekst"/>
+      <w:pStyle w:val="Header"/>
       <w:jc w:val="center"/>
     </w:pPr>
     <w:r>
@@ -5400,7 +5690,7 @@
   </w:p>
   <w:p>
     <w:pPr>
-      <w:pStyle w:val="Koptekst"/>
+      <w:pStyle w:val="Header"/>
     </w:pPr>
   </w:p>
 </w:hdr>
@@ -8713,16 +9003,16 @@
     <w:lsdException w:name="Unresolved Mention" w:semiHidden="1" w:unhideWhenUsed="1"/>
     <w:lsdException w:name="Smart Link" w:semiHidden="1" w:unhideWhenUsed="1"/>
   </w:latentStyles>
-  <w:style w:type="paragraph" w:default="1" w:styleId="Standaard">
+  <w:style w:type="paragraph" w:default="1" w:styleId="Normal">
     <w:name w:val="Normal"/>
     <w:qFormat/>
     <w:rsid w:val="00B44264"/>
   </w:style>
-  <w:style w:type="paragraph" w:styleId="Kop1">
+  <w:style w:type="paragraph" w:styleId="Heading1">
     <w:name w:val="heading 1"/>
-    <w:basedOn w:val="Standaard"/>
-    <w:next w:val="Standaard"/>
-    <w:link w:val="Kop1Char"/>
+    <w:basedOn w:val="Normal"/>
+    <w:next w:val="Normal"/>
+    <w:link w:val="Heading1Char"/>
     <w:uiPriority w:val="9"/>
     <w:qFormat/>
     <w:rsid w:val="00B44264"/>
@@ -8740,11 +9030,11 @@
       <w:szCs w:val="32"/>
     </w:rPr>
   </w:style>
-  <w:style w:type="paragraph" w:styleId="Kop2">
+  <w:style w:type="paragraph" w:styleId="Heading2">
     <w:name w:val="heading 2"/>
-    <w:basedOn w:val="Standaard"/>
-    <w:next w:val="Standaard"/>
-    <w:link w:val="Kop2Char"/>
+    <w:basedOn w:val="Normal"/>
+    <w:next w:val="Normal"/>
+    <w:link w:val="Heading2Char"/>
     <w:uiPriority w:val="9"/>
     <w:unhideWhenUsed/>
     <w:qFormat/>
@@ -8761,11 +9051,11 @@
       <w:sz w:val="32"/>
     </w:rPr>
   </w:style>
-  <w:style w:type="paragraph" w:styleId="Kop3">
+  <w:style w:type="paragraph" w:styleId="Heading3">
     <w:name w:val="heading 3"/>
-    <w:basedOn w:val="Standaard"/>
-    <w:next w:val="Standaard"/>
-    <w:link w:val="Kop3Char"/>
+    <w:basedOn w:val="Normal"/>
+    <w:next w:val="Normal"/>
+    <w:link w:val="Heading3Char"/>
     <w:uiPriority w:val="9"/>
     <w:unhideWhenUsed/>
     <w:qFormat/>
@@ -8785,11 +9075,11 @@
       <w:szCs w:val="24"/>
     </w:rPr>
   </w:style>
-  <w:style w:type="paragraph" w:styleId="Kop4">
+  <w:style w:type="paragraph" w:styleId="Heading4">
     <w:name w:val="heading 4"/>
-    <w:basedOn w:val="Standaard"/>
-    <w:next w:val="Standaard"/>
-    <w:link w:val="Kop4Char"/>
+    <w:basedOn w:val="Normal"/>
+    <w:next w:val="Normal"/>
+    <w:link w:val="Heading4Char"/>
     <w:uiPriority w:val="9"/>
     <w:semiHidden/>
     <w:unhideWhenUsed/>
@@ -8808,11 +9098,11 @@
       <w:color w:val="000000" w:themeColor="text1"/>
     </w:rPr>
   </w:style>
-  <w:style w:type="paragraph" w:styleId="Kop6">
+  <w:style w:type="paragraph" w:styleId="Heading6">
     <w:name w:val="heading 6"/>
-    <w:basedOn w:val="Standaard"/>
-    <w:next w:val="Standaard"/>
-    <w:link w:val="Kop6Char"/>
+    <w:basedOn w:val="Normal"/>
+    <w:next w:val="Normal"/>
+    <w:link w:val="Heading6Char"/>
     <w:uiPriority w:val="9"/>
     <w:semiHidden/>
     <w:unhideWhenUsed/>
@@ -8829,13 +9119,13 @@
       <w:color w:val="1F4D78" w:themeColor="accent1" w:themeShade="7F"/>
     </w:rPr>
   </w:style>
-  <w:style w:type="character" w:default="1" w:styleId="Standaardalinea-lettertype">
+  <w:style w:type="character" w:default="1" w:styleId="DefaultParagraphFont">
     <w:name w:val="Default Paragraph Font"/>
     <w:uiPriority w:val="1"/>
     <w:semiHidden/>
     <w:unhideWhenUsed/>
   </w:style>
-  <w:style w:type="table" w:default="1" w:styleId="Standaardtabel">
+  <w:style w:type="table" w:default="1" w:styleId="TableNormal">
     <w:name w:val="Normal Table"/>
     <w:uiPriority w:val="99"/>
     <w:semiHidden/>
@@ -8850,16 +9140,16 @@
       </w:tblCellMar>
     </w:tblPr>
   </w:style>
-  <w:style w:type="numbering" w:default="1" w:styleId="Geenlijst">
+  <w:style w:type="numbering" w:default="1" w:styleId="NoList">
     <w:name w:val="No List"/>
     <w:uiPriority w:val="99"/>
     <w:semiHidden/>
     <w:unhideWhenUsed/>
   </w:style>
-  <w:style w:type="paragraph" w:styleId="Koptekst">
+  <w:style w:type="paragraph" w:styleId="Header">
     <w:name w:val="header"/>
-    <w:basedOn w:val="Standaard"/>
-    <w:link w:val="KoptekstChar"/>
+    <w:basedOn w:val="Normal"/>
+    <w:link w:val="HeaderChar"/>
     <w:uiPriority w:val="99"/>
     <w:unhideWhenUsed/>
     <w:rsid w:val="003D0CAD"/>
@@ -8871,17 +9161,17 @@
       <w:spacing w:after="0" w:line="240" w:lineRule="auto"/>
     </w:pPr>
   </w:style>
-  <w:style w:type="character" w:customStyle="1" w:styleId="KoptekstChar">
-    <w:name w:val="Koptekst Char"/>
-    <w:basedOn w:val="Standaardalinea-lettertype"/>
-    <w:link w:val="Koptekst"/>
+  <w:style w:type="character" w:customStyle="1" w:styleId="HeaderChar">
+    <w:name w:val="Header Char"/>
+    <w:basedOn w:val="DefaultParagraphFont"/>
+    <w:link w:val="Header"/>
     <w:uiPriority w:val="99"/>
     <w:rsid w:val="003D0CAD"/>
   </w:style>
-  <w:style w:type="paragraph" w:styleId="Voettekst">
+  <w:style w:type="paragraph" w:styleId="Footer">
     <w:name w:val="footer"/>
-    <w:basedOn w:val="Standaard"/>
-    <w:link w:val="VoettekstChar"/>
+    <w:basedOn w:val="Normal"/>
+    <w:link w:val="FooterChar"/>
     <w:uiPriority w:val="99"/>
     <w:unhideWhenUsed/>
     <w:rsid w:val="003D0CAD"/>
@@ -8893,16 +9183,16 @@
       <w:spacing w:after="0" w:line="240" w:lineRule="auto"/>
     </w:pPr>
   </w:style>
-  <w:style w:type="character" w:customStyle="1" w:styleId="VoettekstChar">
-    <w:name w:val="Voettekst Char"/>
-    <w:basedOn w:val="Standaardalinea-lettertype"/>
-    <w:link w:val="Voettekst"/>
+  <w:style w:type="character" w:customStyle="1" w:styleId="FooterChar">
+    <w:name w:val="Footer Char"/>
+    <w:basedOn w:val="DefaultParagraphFont"/>
+    <w:link w:val="Footer"/>
     <w:uiPriority w:val="99"/>
     <w:rsid w:val="003D0CAD"/>
   </w:style>
-  <w:style w:type="table" w:styleId="Tabelraster">
+  <w:style w:type="table" w:styleId="TableGrid">
     <w:name w:val="Table Grid"/>
-    <w:basedOn w:val="Standaardtabel"/>
+    <w:basedOn w:val="TableNormal"/>
     <w:uiPriority w:val="59"/>
     <w:rsid w:val="003D0CAD"/>
     <w:pPr>
@@ -8919,9 +9209,9 @@
       </w:tblBorders>
     </w:tblPr>
   </w:style>
-  <w:style w:type="paragraph" w:styleId="Lijstalinea">
+  <w:style w:type="paragraph" w:styleId="ListParagraph">
     <w:name w:val="List Paragraph"/>
-    <w:basedOn w:val="Standaard"/>
+    <w:basedOn w:val="Normal"/>
     <w:uiPriority w:val="34"/>
     <w:qFormat/>
     <w:rsid w:val="00716F2B"/>
@@ -8930,10 +9220,10 @@
       <w:contextualSpacing/>
     </w:pPr>
   </w:style>
-  <w:style w:type="character" w:customStyle="1" w:styleId="Kop1Char">
-    <w:name w:val="Kop 1 Char"/>
-    <w:basedOn w:val="Standaardalinea-lettertype"/>
-    <w:link w:val="Kop1"/>
+  <w:style w:type="character" w:customStyle="1" w:styleId="Heading1Char">
+    <w:name w:val="Heading 1 Char"/>
+    <w:basedOn w:val="DefaultParagraphFont"/>
+    <w:link w:val="Heading1"/>
     <w:uiPriority w:val="9"/>
     <w:rsid w:val="00B44264"/>
     <w:rPr>
@@ -8943,10 +9233,10 @@
       <w:szCs w:val="32"/>
     </w:rPr>
   </w:style>
-  <w:style w:type="character" w:customStyle="1" w:styleId="Kop2Char">
-    <w:name w:val="Kop 2 Char"/>
-    <w:basedOn w:val="Standaardalinea-lettertype"/>
-    <w:link w:val="Kop2"/>
+  <w:style w:type="character" w:customStyle="1" w:styleId="Heading2Char">
+    <w:name w:val="Heading 2 Char"/>
+    <w:basedOn w:val="DefaultParagraphFont"/>
+    <w:link w:val="Heading2"/>
     <w:uiPriority w:val="9"/>
     <w:rsid w:val="00AE7D59"/>
     <w:rPr>
@@ -8955,10 +9245,10 @@
       <w:sz w:val="32"/>
     </w:rPr>
   </w:style>
-  <w:style w:type="character" w:customStyle="1" w:styleId="Kop3Char">
-    <w:name w:val="Kop 3 Char"/>
-    <w:basedOn w:val="Standaardalinea-lettertype"/>
-    <w:link w:val="Kop3"/>
+  <w:style w:type="character" w:customStyle="1" w:styleId="Heading3Char">
+    <w:name w:val="Heading 3 Char"/>
+    <w:basedOn w:val="DefaultParagraphFont"/>
+    <w:link w:val="Heading3"/>
     <w:uiPriority w:val="9"/>
     <w:rsid w:val="00AE7D59"/>
     <w:rPr>
@@ -8970,10 +9260,10 @@
       <w:szCs w:val="24"/>
     </w:rPr>
   </w:style>
-  <w:style w:type="character" w:customStyle="1" w:styleId="Kop4Char">
-    <w:name w:val="Kop 4 Char"/>
-    <w:basedOn w:val="Standaardalinea-lettertype"/>
-    <w:link w:val="Kop4"/>
+  <w:style w:type="character" w:customStyle="1" w:styleId="Heading4Char">
+    <w:name w:val="Heading 4 Char"/>
+    <w:basedOn w:val="DefaultParagraphFont"/>
+    <w:link w:val="Heading4"/>
     <w:uiPriority w:val="9"/>
     <w:semiHidden/>
     <w:rsid w:val="00B44264"/>
@@ -8984,10 +9274,10 @@
       <w:color w:val="000000" w:themeColor="text1"/>
     </w:rPr>
   </w:style>
-  <w:style w:type="paragraph" w:styleId="Ballontekst">
+  <w:style w:type="paragraph" w:styleId="BalloonText">
     <w:name w:val="Balloon Text"/>
-    <w:basedOn w:val="Standaard"/>
-    <w:link w:val="BallontekstChar"/>
+    <w:basedOn w:val="Normal"/>
+    <w:link w:val="BalloonTextChar"/>
     <w:uiPriority w:val="99"/>
     <w:semiHidden/>
     <w:unhideWhenUsed/>
@@ -9001,10 +9291,10 @@
       <w:szCs w:val="16"/>
     </w:rPr>
   </w:style>
-  <w:style w:type="character" w:customStyle="1" w:styleId="BallontekstChar">
-    <w:name w:val="Ballontekst Char"/>
-    <w:basedOn w:val="Standaardalinea-lettertype"/>
-    <w:link w:val="Ballontekst"/>
+  <w:style w:type="character" w:customStyle="1" w:styleId="BalloonTextChar">
+    <w:name w:val="Balloon Text Char"/>
+    <w:basedOn w:val="DefaultParagraphFont"/>
+    <w:link w:val="BalloonText"/>
     <w:uiPriority w:val="99"/>
     <w:semiHidden/>
     <w:rsid w:val="00756DEF"/>
@@ -9014,10 +9304,10 @@
       <w:szCs w:val="16"/>
     </w:rPr>
   </w:style>
-  <w:style w:type="paragraph" w:styleId="Kopvaninhoudsopgave">
+  <w:style w:type="paragraph" w:styleId="TOCHeading">
     <w:name w:val="TOC Heading"/>
-    <w:basedOn w:val="Kop1"/>
-    <w:next w:val="Standaard"/>
+    <w:basedOn w:val="Heading1"/>
+    <w:next w:val="Normal"/>
     <w:uiPriority w:val="39"/>
     <w:unhideWhenUsed/>
     <w:qFormat/>
@@ -9037,10 +9327,10 @@
       <w:lang w:eastAsia="nl-NL"/>
     </w:rPr>
   </w:style>
-  <w:style w:type="paragraph" w:styleId="Inhopg1">
+  <w:style w:type="paragraph" w:styleId="TOC1">
     <w:name w:val="toc 1"/>
-    <w:basedOn w:val="Standaard"/>
-    <w:next w:val="Standaard"/>
+    <w:basedOn w:val="Normal"/>
+    <w:next w:val="Normal"/>
     <w:autoRedefine/>
     <w:uiPriority w:val="39"/>
     <w:unhideWhenUsed/>
@@ -9054,7 +9344,7 @@
   </w:style>
   <w:style w:type="character" w:styleId="Hyperlink">
     <w:name w:val="Hyperlink"/>
-    <w:basedOn w:val="Standaardalinea-lettertype"/>
+    <w:basedOn w:val="DefaultParagraphFont"/>
     <w:uiPriority w:val="99"/>
     <w:unhideWhenUsed/>
     <w:rsid w:val="00DD7202"/>
@@ -9063,11 +9353,11 @@
       <w:u w:val="single"/>
     </w:rPr>
   </w:style>
-  <w:style w:type="paragraph" w:styleId="Titel">
+  <w:style w:type="paragraph" w:styleId="Title">
     <w:name w:val="Title"/>
-    <w:basedOn w:val="Standaard"/>
-    <w:next w:val="Standaard"/>
-    <w:link w:val="TitelChar"/>
+    <w:basedOn w:val="Normal"/>
+    <w:next w:val="Normal"/>
+    <w:link w:val="TitleChar"/>
     <w:uiPriority w:val="10"/>
     <w:qFormat/>
     <w:rsid w:val="00DD7202"/>
@@ -9087,10 +9377,10 @@
       <w:szCs w:val="52"/>
     </w:rPr>
   </w:style>
-  <w:style w:type="character" w:customStyle="1" w:styleId="TitelChar">
-    <w:name w:val="Titel Char"/>
-    <w:basedOn w:val="Standaardalinea-lettertype"/>
-    <w:link w:val="Titel"/>
+  <w:style w:type="character" w:customStyle="1" w:styleId="TitleChar">
+    <w:name w:val="Title Char"/>
+    <w:basedOn w:val="DefaultParagraphFont"/>
+    <w:link w:val="Title"/>
     <w:uiPriority w:val="10"/>
     <w:rsid w:val="00DD7202"/>
     <w:rPr>
@@ -9102,11 +9392,11 @@
       <w:szCs w:val="52"/>
     </w:rPr>
   </w:style>
-  <w:style w:type="paragraph" w:styleId="Ondertitel">
+  <w:style w:type="paragraph" w:styleId="Subtitle">
     <w:name w:val="Subtitle"/>
-    <w:basedOn w:val="Standaard"/>
-    <w:next w:val="Standaard"/>
-    <w:link w:val="OndertitelChar"/>
+    <w:basedOn w:val="Normal"/>
+    <w:next w:val="Normal"/>
+    <w:link w:val="SubtitleChar"/>
     <w:uiPriority w:val="11"/>
     <w:qFormat/>
     <w:rsid w:val="00DD7202"/>
@@ -9125,10 +9415,10 @@
       <w:szCs w:val="24"/>
     </w:rPr>
   </w:style>
-  <w:style w:type="character" w:customStyle="1" w:styleId="OndertitelChar">
-    <w:name w:val="Ondertitel Char"/>
-    <w:basedOn w:val="Standaardalinea-lettertype"/>
-    <w:link w:val="Ondertitel"/>
+  <w:style w:type="character" w:customStyle="1" w:styleId="SubtitleChar">
+    <w:name w:val="Subtitle Char"/>
+    <w:basedOn w:val="DefaultParagraphFont"/>
+    <w:link w:val="Subtitle"/>
     <w:uiPriority w:val="11"/>
     <w:rsid w:val="00DD7202"/>
     <w:rPr>
@@ -9141,9 +9431,9 @@
       <w:szCs w:val="24"/>
     </w:rPr>
   </w:style>
-  <w:style w:type="character" w:styleId="Verwijzingopmerking">
+  <w:style w:type="character" w:styleId="CommentReference">
     <w:name w:val="annotation reference"/>
-    <w:basedOn w:val="Standaardalinea-lettertype"/>
+    <w:basedOn w:val="DefaultParagraphFont"/>
     <w:uiPriority w:val="99"/>
     <w:semiHidden/>
     <w:unhideWhenUsed/>
@@ -9153,10 +9443,10 @@
       <w:szCs w:val="18"/>
     </w:rPr>
   </w:style>
-  <w:style w:type="paragraph" w:styleId="Tekstopmerking">
+  <w:style w:type="paragraph" w:styleId="CommentText">
     <w:name w:val="annotation text"/>
-    <w:basedOn w:val="Standaard"/>
-    <w:link w:val="TekstopmerkingChar"/>
+    <w:basedOn w:val="Normal"/>
+    <w:link w:val="CommentTextChar"/>
     <w:uiPriority w:val="99"/>
     <w:semiHidden/>
     <w:unhideWhenUsed/>
@@ -9169,10 +9459,10 @@
       <w:szCs w:val="24"/>
     </w:rPr>
   </w:style>
-  <w:style w:type="character" w:customStyle="1" w:styleId="TekstopmerkingChar">
-    <w:name w:val="Tekst opmerking Char"/>
-    <w:basedOn w:val="Standaardalinea-lettertype"/>
-    <w:link w:val="Tekstopmerking"/>
+  <w:style w:type="character" w:customStyle="1" w:styleId="CommentTextChar">
+    <w:name w:val="Comment Text Char"/>
+    <w:basedOn w:val="DefaultParagraphFont"/>
+    <w:link w:val="CommentText"/>
     <w:uiPriority w:val="99"/>
     <w:semiHidden/>
     <w:rsid w:val="001F68CA"/>
@@ -9181,11 +9471,11 @@
       <w:szCs w:val="24"/>
     </w:rPr>
   </w:style>
-  <w:style w:type="paragraph" w:styleId="Onderwerpvanopmerking">
+  <w:style w:type="paragraph" w:styleId="CommentSubject">
     <w:name w:val="annotation subject"/>
-    <w:basedOn w:val="Tekstopmerking"/>
-    <w:next w:val="Tekstopmerking"/>
-    <w:link w:val="OnderwerpvanopmerkingChar"/>
+    <w:basedOn w:val="CommentText"/>
+    <w:next w:val="CommentText"/>
+    <w:link w:val="CommentSubjectChar"/>
     <w:uiPriority w:val="99"/>
     <w:semiHidden/>
     <w:unhideWhenUsed/>
@@ -9197,10 +9487,10 @@
       <w:szCs w:val="20"/>
     </w:rPr>
   </w:style>
-  <w:style w:type="character" w:customStyle="1" w:styleId="OnderwerpvanopmerkingChar">
-    <w:name w:val="Onderwerp van opmerking Char"/>
-    <w:basedOn w:val="TekstopmerkingChar"/>
-    <w:link w:val="Onderwerpvanopmerking"/>
+  <w:style w:type="character" w:customStyle="1" w:styleId="CommentSubjectChar">
+    <w:name w:val="Comment Subject Char"/>
+    <w:basedOn w:val="CommentTextChar"/>
+    <w:link w:val="CommentSubject"/>
     <w:uiPriority w:val="99"/>
     <w:semiHidden/>
     <w:rsid w:val="001F68CA"/>
@@ -9213,12 +9503,12 @@
   </w:style>
   <w:style w:type="character" w:customStyle="1" w:styleId="lewnzc">
     <w:name w:val="lewnzc"/>
-    <w:basedOn w:val="Standaardalinea-lettertype"/>
+    <w:basedOn w:val="DefaultParagraphFont"/>
     <w:rsid w:val="003A1469"/>
   </w:style>
-  <w:style w:type="character" w:styleId="Nadruk">
+  <w:style w:type="character" w:styleId="Emphasis">
     <w:name w:val="Emphasis"/>
-    <w:basedOn w:val="Standaardalinea-lettertype"/>
+    <w:basedOn w:val="DefaultParagraphFont"/>
     <w:uiPriority w:val="20"/>
     <w:qFormat/>
     <w:rsid w:val="003A1469"/>
@@ -9229,10 +9519,10 @@
   </w:style>
   <w:style w:type="character" w:customStyle="1" w:styleId="tlssbb">
     <w:name w:val="tlssbb"/>
-    <w:basedOn w:val="Standaardalinea-lettertype"/>
+    <w:basedOn w:val="DefaultParagraphFont"/>
     <w:rsid w:val="00B2286A"/>
   </w:style>
-  <w:style w:type="paragraph" w:styleId="Geenafstand">
+  <w:style w:type="paragraph" w:styleId="NoSpacing">
     <w:name w:val="No Spacing"/>
     <w:uiPriority w:val="1"/>
     <w:qFormat/>
@@ -9241,10 +9531,10 @@
       <w:spacing w:after="0" w:line="240" w:lineRule="auto"/>
     </w:pPr>
   </w:style>
-  <w:style w:type="character" w:customStyle="1" w:styleId="Kop6Char">
-    <w:name w:val="Kop 6 Char"/>
-    <w:basedOn w:val="Standaardalinea-lettertype"/>
-    <w:link w:val="Kop6"/>
+  <w:style w:type="character" w:customStyle="1" w:styleId="Heading6Char">
+    <w:name w:val="Heading 6 Char"/>
+    <w:basedOn w:val="DefaultParagraphFont"/>
+    <w:link w:val="Heading6"/>
     <w:uiPriority w:val="9"/>
     <w:semiHidden/>
     <w:rsid w:val="00710649"/>
@@ -9253,10 +9543,10 @@
       <w:color w:val="1F4D78" w:themeColor="accent1" w:themeShade="7F"/>
     </w:rPr>
   </w:style>
-  <w:style w:type="paragraph" w:styleId="Inhopg3">
+  <w:style w:type="paragraph" w:styleId="TOC3">
     <w:name w:val="toc 3"/>
-    <w:basedOn w:val="Standaard"/>
-    <w:next w:val="Standaard"/>
+    <w:basedOn w:val="Normal"/>
+    <w:next w:val="Normal"/>
     <w:autoRedefine/>
     <w:uiPriority w:val="39"/>
     <w:unhideWhenUsed/>
@@ -9266,10 +9556,10 @@
       <w:ind w:left="440"/>
     </w:pPr>
   </w:style>
-  <w:style w:type="paragraph" w:styleId="Inhopg2">
+  <w:style w:type="paragraph" w:styleId="TOC2">
     <w:name w:val="toc 2"/>
-    <w:basedOn w:val="Standaard"/>
-    <w:next w:val="Standaard"/>
+    <w:basedOn w:val="Normal"/>
+    <w:next w:val="Normal"/>
     <w:autoRedefine/>
     <w:uiPriority w:val="39"/>
     <w:unhideWhenUsed/>
@@ -9544,6 +9834,17 @@
 </file>
 
 <file path=customXml/item1.xml><?xml version="1.0" encoding="utf-8"?>
+<p:properties xmlns:p="http://schemas.microsoft.com/office/2006/metadata/properties" xmlns:xsi="http://www.w3.org/2001/XMLSchema-instance" xmlns:pc="http://schemas.microsoft.com/office/infopath/2007/PartnerControls">
+  <documentManagement>
+    <TaxCatchAll xmlns="32dd6115-ce5d-46b4-b638-9e7d5ca6cbee" xsi:nil="true"/>
+    <lcf76f155ced4ddcb4097134ff3c332f xmlns="094ecc41-7a37-40c9-8390-f18431712098">
+      <Terms xmlns="http://schemas.microsoft.com/office/infopath/2007/PartnerControls"/>
+    </lcf76f155ced4ddcb4097134ff3c332f>
+  </documentManagement>
+</p:properties>
+</file>
+
+<file path=customXml/item2.xml><?xml version="1.0" encoding="utf-8"?>
 <ct:contentTypeSchema xmlns:ct="http://schemas.microsoft.com/office/2006/metadata/contentType" xmlns:ma="http://schemas.microsoft.com/office/2006/metadata/properties/metaAttributes" ct:_="" ma:_="" ma:contentTypeName="Document" ma:contentTypeID="0x010100D5188FA4F7421B4A93E65E307A769E27" ma:contentTypeVersion="15" ma:contentTypeDescription="Een nieuw document maken." ma:contentTypeScope="" ma:versionID="9bfd002f47f5f7e7b2724518f3fad1a5">
   <xsd:schema xmlns:xsd="http://www.w3.org/2001/XMLSchema" xmlns:xs="http://www.w3.org/2001/XMLSchema" xmlns:p="http://schemas.microsoft.com/office/2006/metadata/properties" xmlns:ns2="094ecc41-7a37-40c9-8390-f18431712098" xmlns:ns3="32dd6115-ce5d-46b4-b638-9e7d5ca6cbee" targetNamespace="http://schemas.microsoft.com/office/2006/metadata/properties" ma:root="true" ma:fieldsID="e2c1118370456e9a6d2939e9bd0f2e89" ns2:_="" ns3:_="">
     <xsd:import namespace="094ecc41-7a37-40c9-8390-f18431712098"/>
@@ -9778,7 +10079,7 @@
 </ct:contentTypeSchema>
 </file>
 
-<file path=customXml/item2.xml><?xml version="1.0" encoding="utf-8"?>
+<file path=customXml/item3.xml><?xml version="1.0" encoding="utf-8"?>
 <?mso-contentType ?>
 <FormTemplates xmlns="http://schemas.microsoft.com/sharepoint/v3/contenttype/forms">
   <Display>DocumentLibraryForm</Display>
@@ -9787,22 +10088,22 @@
 </FormTemplates>
 </file>
 
-<file path=customXml/item3.xml><?xml version="1.0" encoding="utf-8"?>
+<file path=customXml/item4.xml><?xml version="1.0" encoding="utf-8"?>
 <b:Sources xmlns:b="http://schemas.openxmlformats.org/officeDocument/2006/bibliography" xmlns="http://schemas.openxmlformats.org/officeDocument/2006/bibliography" SelectedStyle="\APASixthEditionOfficeOnline.xsl" StyleName="APA" Version="6"/>
 </file>
 
-<file path=customXml/item4.xml><?xml version="1.0" encoding="utf-8"?>
-<p:properties xmlns:p="http://schemas.microsoft.com/office/2006/metadata/properties" xmlns:xsi="http://www.w3.org/2001/XMLSchema-instance" xmlns:pc="http://schemas.microsoft.com/office/infopath/2007/PartnerControls">
-  <documentManagement>
-    <TaxCatchAll xmlns="32dd6115-ce5d-46b4-b638-9e7d5ca6cbee" xsi:nil="true"/>
-    <lcf76f155ced4ddcb4097134ff3c332f xmlns="094ecc41-7a37-40c9-8390-f18431712098">
-      <Terms xmlns="http://schemas.microsoft.com/office/infopath/2007/PartnerControls"/>
-    </lcf76f155ced4ddcb4097134ff3c332f>
-  </documentManagement>
-</p:properties>
+<file path=customXml/itemProps1.xml><?xml version="1.0" encoding="utf-8"?>
+<ds:datastoreItem xmlns:ds="http://schemas.openxmlformats.org/officeDocument/2006/customXml" ds:itemID="{846B1C81-E993-40E7-BCC5-DA63F0CD945C}">
+  <ds:schemaRefs>
+    <ds:schemaRef ds:uri="http://schemas.microsoft.com/office/2006/metadata/properties"/>
+    <ds:schemaRef ds:uri="http://schemas.microsoft.com/office/infopath/2007/PartnerControls"/>
+    <ds:schemaRef ds:uri="32dd6115-ce5d-46b4-b638-9e7d5ca6cbee"/>
+    <ds:schemaRef ds:uri="094ecc41-7a37-40c9-8390-f18431712098"/>
+  </ds:schemaRefs>
+</ds:datastoreItem>
 </file>
 
-<file path=customXml/itemProps1.xml><?xml version="1.0" encoding="utf-8"?>
+<file path=customXml/itemProps2.xml><?xml version="1.0" encoding="utf-8"?>
 <ds:datastoreItem xmlns:ds="http://schemas.openxmlformats.org/officeDocument/2006/customXml" ds:itemID="{6D953465-DEAC-453F-952B-2BF171A6BD1D}">
   <ds:schemaRefs>
     <ds:schemaRef ds:uri="http://schemas.microsoft.com/office/2006/metadata/contentType"/>
@@ -9821,7 +10122,7 @@
 </ds:datastoreItem>
 </file>
 
-<file path=customXml/itemProps2.xml><?xml version="1.0" encoding="utf-8"?>
+<file path=customXml/itemProps3.xml><?xml version="1.0" encoding="utf-8"?>
 <ds:datastoreItem xmlns:ds="http://schemas.openxmlformats.org/officeDocument/2006/customXml" ds:itemID="{C6916C6B-E06E-47CD-A094-BBBE44C5EA8C}">
   <ds:schemaRefs>
     <ds:schemaRef ds:uri="http://schemas.microsoft.com/sharepoint/v3/contenttype/forms"/>
@@ -9829,21 +10130,10 @@
 </ds:datastoreItem>
 </file>
 
-<file path=customXml/itemProps3.xml><?xml version="1.0" encoding="utf-8"?>
+<file path=customXml/itemProps4.xml><?xml version="1.0" encoding="utf-8"?>
 <ds:datastoreItem xmlns:ds="http://schemas.openxmlformats.org/officeDocument/2006/customXml" ds:itemID="{72B7D650-2FAA-4D72-B587-235E59E6AC26}">
   <ds:schemaRefs>
     <ds:schemaRef ds:uri="http://schemas.openxmlformats.org/officeDocument/2006/bibliography"/>
   </ds:schemaRefs>
 </ds:datastoreItem>
-</file>
-
-<file path=customXml/itemProps4.xml><?xml version="1.0" encoding="utf-8"?>
-<ds:datastoreItem xmlns:ds="http://schemas.openxmlformats.org/officeDocument/2006/customXml" ds:itemID="{846B1C81-E993-40E7-BCC5-DA63F0CD945C}">
-  <ds:schemaRefs>
-    <ds:schemaRef ds:uri="http://schemas.microsoft.com/office/2006/metadata/properties"/>
-    <ds:schemaRef ds:uri="http://schemas.microsoft.com/office/infopath/2007/PartnerControls"/>
-    <ds:schemaRef ds:uri="32dd6115-ce5d-46b4-b638-9e7d5ca6cbee"/>
-    <ds:schemaRef ds:uri="094ecc41-7a37-40c9-8390-f18431712098"/>
-  </ds:schemaRefs>
-</ds:datastoreItem>
 </file>
</xml_diff>